<commit_message>
feat: normaliza cabecera IESS y tablas DOCX
- Agrega institucion, direccion y subdireccion a la cabecera institucional.
- Define ESTANDAR, version 1.0 y fecha actual como valores por defecto.
- Fuerza tablas RMarkdown y tablas Markdown a ocupar el 100% del ancho util.
- Usa la plantilla de referencia versionada cuando no existe la copia local.
- Incluye el logo y documenta la prioridad de metadatos explicitos.
</commit_message>
<xml_diff>
--- a/DocumentaciónIESS/referencia_estilo_iess.docx
+++ b/DocumentaciónIESS/referencia_estilo_iess.docx
@@ -4116,6 +4116,9 @@
       <w:pgSz w:h="15840" w:w="12240"/>
       <w:pgMar w:bottom="1417" w:footer="720" w:gutter="0" w:header="720" w:left="1417" w:right="1417" w:top="1417"/>
       <w:cols w:space="720"/>
+      <w:headerReference w:type="default" r:id="rId19"/>
+      <w:headerReference w:type="first" r:id="rId20"/>
+      <w:titlePg/>
     </w:sectPr>
   </w:body>
 </w:document>
@@ -4259,6 +4262,461 @@
     </w:p>
   </w:footnote>
 </w:footnotes>
+</file>
+
+<file path=word/header1.xml><?xml version="1.0" encoding="utf-8"?>
+<w:hdr xmlns:wpc="http://schemas.microsoft.com/office/word/2010/wordprocessingCanvas" xmlns:mc="http://schemas.openxmlformats.org/markup-compatibility/2006" xmlns:o="urn:schemas-microsoft-com:office:office" xmlns:r="http://schemas.openxmlformats.org/officeDocument/2006/relationships" xmlns:m="http://schemas.openxmlformats.org/officeDocument/2006/math" xmlns:v="urn:schemas-microsoft-com:vml" xmlns:wp14="http://schemas.microsoft.com/office/word/2010/wordprocessingDrawing" xmlns:wp="http://schemas.openxmlformats.org/drawingml/2006/wordprocessingDrawing" xmlns:w10="urn:schemas-microsoft-com:office:word" xmlns:w="http://schemas.openxmlformats.org/wordprocessingml/2006/main" xmlns:w14="http://schemas.microsoft.com/office/word/2010/wordml" xmlns:wpg="http://schemas.microsoft.com/office/word/2010/wordprocessingGroup" xmlns:wpi="http://schemas.microsoft.com/office/word/2010/wordprocessingInk" xmlns:wne="http://schemas.microsoft.com/office/word/2006/wordml" xmlns:wps="http://schemas.microsoft.com/office/word/2010/wordprocessingShape" xmlns:a="http://schemas.openxmlformats.org/drawingml/2006/main" xmlns:pic="http://schemas.openxmlformats.org/drawingml/2006/picture" mc:Ignorable="w14 wp14">
+  <w:tbl>
+    <w:tblPr>
+      <w:tblW w:w="5000" w:type="pct"/>
+      <w:tblBorders>
+        <w:top w:val="single" w:sz="12" w:space="0" w:color="000000"/>
+        <w:left w:val="single" w:sz="12" w:space="0" w:color="000000"/>
+        <w:bottom w:val="single" w:sz="12" w:space="0" w:color="000000"/>
+        <w:right w:val="single" w:sz="12" w:space="0" w:color="000000"/>
+        <w:insideH w:val="single" w:sz="6" w:space="0" w:color="000000"/>
+        <w:insideV w:val="single" w:sz="6" w:space="0" w:color="000000"/>
+      </w:tblBorders>
+      <w:tblLayout w:type="fixed"/>
+      <w:tblCellMar>
+        <w:top w:w="40" w:type="dxa"/>
+        <w:left w:w="80" w:type="dxa"/>
+        <w:bottom w:w="40" w:type="dxa"/>
+        <w:right w:w="80" w:type="dxa"/>
+      </w:tblCellMar>
+    </w:tblPr>
+    <w:tblGrid>
+      <w:gridCol w:w="1600"/>
+      <w:gridCol w:w="6150"/>
+      <w:gridCol w:w="2250"/>
+    </w:tblGrid>
+    <!-- ==================== FILA 1: COD ==================== -->
+    <w:tr>
+      <w:trPr>
+        <w:trHeight w:val="280" w:hRule="atLeast"/>
+      </w:trPr>
+      <!-- Logo IESS (Inicio merge 4 filas) -->
+      <w:tc>
+        <w:tcPr>
+          <w:tcW w:w="1600" w:type="dxa"/>
+          <w:vMerge w:val="restart"/>
+          <w:vAlign w:val="center"/>
+        </w:tcPr>
+        <w:p>
+          <w:pPr>
+            <w:jc w:val="center"/>
+            <w:spacing w:after="0" w:line="240" w:lineRule="auto"/>
+          </w:pPr>
+          <w:r>
+            <w:rPr>
+              <w:noProof/>
+            </w:rPr>
+            <w:drawing>
+              <wp:inline distT="0" distB="0" distL="0" distR="0">
+                <wp:extent cx="1050000" cy="700000"/>
+                <wp:docPr id="1" name="Logo IESS"/>
+                <a:graphic>
+                  <a:graphicData uri="http://schemas.openxmlformats.org/drawingml/2006/picture">
+                    <pic:pic>
+                      <pic:nvPicPr>
+                        <pic:cNvPr id="1" name="logo_iess.png"/>
+                        <pic:cNvPicPr/>
+                      </pic:nvPicPr>
+                      <pic:blipFill>
+                        <a:blip r:embed="rId999"/>
+                        <a:stretch>
+                          <a:fillRect/>
+                        </a:stretch>
+                      </pic:blipFill>
+                      <pic:spPr>
+                        <a:xfrm>
+                          <a:off x="0" y="0"/>
+                          <a:ext cx="1050000" cy="700000"/>
+                        </a:xfrm>
+                        <a:prstGeom prst="rect">
+                          <a:avLst/>
+                        </a:prstGeom>
+                      </pic:spPr>
+                    </pic:pic>
+                  </a:graphicData>
+                </a:graphic>
+              </wp:inline>
+            </w:drawing>
+          </w:r>
+        </w:p>
+      </w:tc>
+      <!-- Centro: Institución / Dirección / Subdirección (Inicio merge filas 1 y 2) -->
+      <w:tc>
+        <w:tcPr>
+          <w:tcW w:w="6150" w:type="dxa"/>
+          <w:vMerge w:val="restart"/>
+          <w:vAlign w:val="center"/>
+        </w:tcPr>
+        <!-- 1. INSTITUTO ECUATORIANO DE SEGURIDAD SOCIAL: 11pt, Bold -->
+        <w:p>
+          <w:pPr>
+            <w:jc w:val="center"/>
+            <w:spacing w:after="0" w:line="240" w:lineRule="auto"/>
+          </w:pPr>
+          <w:r>
+            <w:rPr>
+              <w:rFonts w:ascii="Calibri" w:hAnsi="Calibri" w:cs="Calibri"/>
+              <w:b/>
+              <w:sz w:val="22"/>
+              <w:szCs w:val="22"/>
+            </w:rPr>
+            <w:t>INSTITUTO ECUATORIANO DE SEGURIDAD SOCIAL</w:t>
+          </w:r>
+        </w:p>
+        <!-- 2. DIRECCIÓN NACIONAL DE TECNOLOGÍAS DE LA INFORMACIÓN: 13pt (más grande), Bold -->
+        <w:p>
+          <w:pPr>
+            <w:jc w:val="center"/>
+            <w:spacing w:after="0" w:line="260" w:lineRule="auto"/>
+          </w:pPr>
+          <w:r>
+            <w:rPr>
+              <w:rFonts w:ascii="Calibri" w:hAnsi="Calibri" w:cs="Calibri"/>
+              <w:b/>
+              <w:sz w:val="26"/>
+              <w:szCs w:val="26"/>
+            </w:rPr>
+            <w:t>{{DIRECTION}}</w:t>
+          </w:r>
+        </w:p>
+        <!-- 3. SUBDIRECCIÓN NACIONAL DE ARQUITECTURA Y SOLUCIONES: 11.5pt, Bold -->
+        <w:p>
+          <w:pPr>
+            <w:jc w:val="center"/>
+            <w:spacing w:after="0" w:line="240" w:lineRule="auto"/>
+          </w:pPr>
+          <w:r>
+            <w:rPr>
+              <w:rFonts w:ascii="Calibri" w:hAnsi="Calibri" w:cs="Calibri"/>
+              <w:b/>
+              <w:sz w:val="23"/>
+              <w:szCs w:val="23"/>
+            </w:rPr>
+            <w:t>{{SUBDIRECTION}}</w:t>
+          </w:r>
+        </w:p>
+      </w:tc>
+      <!-- Derecha Fila 1: COD -->
+      <w:tc>
+        <w:tcPr>
+          <w:tcW w:w="2250" w:type="dxa"/>
+          <w:vAlign w:val="center"/>
+        </w:tcPr>
+        <w:p>
+          <w:pPr>
+            <w:spacing w:after="0" w:line="240" w:lineRule="auto"/>
+          </w:pPr>
+          <w:r>
+            <w:rPr>
+              <w:rFonts w:ascii="Calibri" w:hAnsi="Calibri" w:cs="Calibri"/>
+              <w:b/>
+              <w:sz w:val="18"/>
+              <w:szCs w:val="18"/>
+            </w:rPr>
+            <w:t xml:space="preserve">COD: </w:t>
+          </w:r>
+          <w:r>
+            <w:rPr>
+              <w:rFonts w:ascii="Calibri" w:hAnsi="Calibri" w:cs="Calibri"/>
+              <w:sz w:val="18"/>
+              <w:szCs w:val="18"/>
+            </w:rPr>
+            <w:t>{{FORM_CODE}}</w:t>
+          </w:r>
+        </w:p>
+      </w:tc>
+    </w:tr>
+    <!-- ==================== FILA 2: FECHA ==================== -->
+    <w:tr>
+      <w:trPr>
+        <w:trHeight w:val="280" w:hRule="atLeast"/>
+      </w:trPr>
+      <!-- Logo (merge cont) -->
+      <w:tc>
+        <w:tcPr>
+          <w:tcW w:w="1600" w:type="dxa"/>
+          <w:vMerge/>
+        </w:tcPr>
+        <w:p>
+          <w:pPr>
+            <w:spacing w:after="0" w:line="240" w:lineRule="auto"/>
+          </w:pPr>
+        </w:p>
+      </w:tc>
+      <!-- Centro (merge cont de filas 1 y 2) -->
+      <w:tc>
+        <w:tcPr>
+          <w:tcW w:w="6150" w:type="dxa"/>
+          <w:vMerge/>
+        </w:tcPr>
+        <w:p>
+          <w:pPr>
+            <w:spacing w:after="0" w:line="240" w:lineRule="auto"/>
+          </w:pPr>
+        </w:p>
+      </w:tc>
+      <!-- Derecha Fila 2: FECHA -->
+      <w:tc>
+        <w:tcPr>
+          <w:tcW w:w="2250" w:type="dxa"/>
+          <w:vAlign w:val="center"/>
+        </w:tcPr>
+        <w:p>
+          <w:pPr>
+            <w:spacing w:after="0" w:line="240" w:lineRule="auto"/>
+          </w:pPr>
+          <w:r>
+            <w:rPr>
+              <w:rFonts w:ascii="Calibri" w:hAnsi="Calibri" w:cs="Calibri"/>
+              <w:b/>
+              <w:sz w:val="18"/>
+              <w:szCs w:val="18"/>
+            </w:rPr>
+            <w:t xml:space="preserve">FECHA: </w:t>
+          </w:r>
+          <w:r>
+            <w:rPr>
+              <w:rFonts w:ascii="Calibri" w:hAnsi="Calibri" w:cs="Calibri"/>
+              <w:sz w:val="18"/>
+              <w:szCs w:val="18"/>
+            </w:rPr>
+            <w:t>{{DATE}}</w:t>
+          </w:r>
+        </w:p>
+      </w:tc>
+    </w:tr>
+    <!-- ==================== FILA 3: VERSIÓN ==================== -->
+    <w:tr>
+      <w:trPr>
+        <w:trHeight w:val="320" w:hRule="atLeast"/>
+      </w:trPr>
+      <!-- Logo (merge cont) -->
+      <w:tc>
+        <w:tcPr>
+          <w:tcW w:w="1600" w:type="dxa"/>
+          <w:vMerge/>
+        </w:tcPr>
+        <w:p>
+          <w:pPr>
+            <w:spacing w:after="0" w:line="240" w:lineRule="auto"/>
+          </w:pPr>
+        </w:p>
+      </w:tc>
+      <!-- Centro: Tipo de documento (ESTÁNDAR): 14pt, Bold, Centrado (Inicio merge filas 3 y 4) -->
+      <w:tc>
+        <w:tcPr>
+          <w:tcW w:w="6150" w:type="dxa"/>
+          <w:vMerge w:val="restart"/>
+          <w:vAlign w:val="center"/>
+        </w:tcPr>
+        <w:p>
+          <w:pPr>
+            <w:jc w:val="center"/>
+            <w:spacing w:after="0" w:line="260" w:lineRule="auto"/>
+          </w:pPr>
+          <w:r>
+            <w:rPr>
+              <w:rFonts w:ascii="Calibri" w:hAnsi="Calibri" w:cs="Calibri"/>
+              <w:b/>
+              <w:sz w:val="28"/>
+              <w:szCs w:val="28"/>
+            </w:rPr>
+            <w:t>{{DOC_TYPE}}</w:t>
+          </w:r>
+        </w:p>
+      </w:tc>
+      <!-- Derecha Fila 3: VERSIÓN -->
+      <w:tc>
+        <w:tcPr>
+          <w:tcW w:w="2250" w:type="dxa"/>
+          <w:vAlign w:val="center"/>
+        </w:tcPr>
+        <w:p>
+          <w:pPr>
+            <w:spacing w:after="0" w:line="240" w:lineRule="auto"/>
+          </w:pPr>
+          <w:r>
+            <w:rPr>
+              <w:rFonts w:ascii="Calibri" w:hAnsi="Calibri" w:cs="Calibri"/>
+              <w:b/>
+              <w:sz w:val="18"/>
+              <w:szCs w:val="18"/>
+            </w:rPr>
+            <w:t xml:space="preserve">VERSIÓN: </w:t>
+          </w:r>
+          <w:r>
+            <w:rPr>
+              <w:rFonts w:ascii="Calibri" w:hAnsi="Calibri" w:cs="Calibri"/>
+              <w:sz w:val="18"/>
+              <w:szCs w:val="18"/>
+            </w:rPr>
+            <w:t>{{VERSION}}</w:t>
+          </w:r>
+        </w:p>
+      </w:tc>
+    </w:tr>
+    <!-- ==================== FILA 4: PÁG ==================== -->
+    <w:tr>
+      <w:trPr>
+        <w:trHeight w:val="320" w:hRule="atLeast"/>
+      </w:trPr>
+      <!-- Logo (merge cont final) -->
+      <w:tc>
+        <w:tcPr>
+          <w:tcW w:w="1600" w:type="dxa"/>
+          <w:vMerge/>
+        </w:tcPr>
+        <w:p>
+          <w:pPr>
+            <w:spacing w:after="0" w:line="240" w:lineRule="auto"/>
+          </w:pPr>
+        </w:p>
+      </w:tc>
+      <!-- Centro (merge cont de filas 3 y 4) -->
+      <w:tc>
+        <w:tcPr>
+          <w:tcW w:w="6150" w:type="dxa"/>
+          <w:vMerge/>
+        </w:tcPr>
+        <w:p>
+          <w:pPr>
+            <w:spacing w:after="0" w:line="240" w:lineRule="auto"/>
+          </w:pPr>
+        </w:p>
+      </w:tc>
+      <!-- Derecha Fila 4: PÁG. PAGE / NUMPAGES -->
+      <w:tc>
+        <w:tcPr>
+          <w:tcW w:w="2250" w:type="dxa"/>
+          <w:vAlign w:val="center"/>
+        </w:tcPr>
+        <w:p>
+          <w:pPr>
+            <w:spacing w:after="0" w:line="240" w:lineRule="auto"/>
+          </w:pPr>
+          <w:r>
+            <w:rPr>
+              <w:rFonts w:ascii="Calibri" w:hAnsi="Calibri" w:cs="Calibri"/>
+              <w:b/>
+              <w:sz w:val="18"/>
+              <w:szCs w:val="18"/>
+            </w:rPr>
+            <w:t xml:space="preserve">PÁG.: </w:t>
+          </w:r>
+          <w:r>
+            <w:rPr>
+              <w:rFonts w:ascii="Calibri" w:hAnsi="Calibri" w:cs="Calibri"/>
+              <w:sz w:val="18"/>
+              <w:szCs w:val="18"/>
+            </w:rPr>
+            <w:fldChar w:fldCharType="begin"/>
+          </w:r>
+          <w:r>
+            <w:rPr>
+              <w:rFonts w:ascii="Calibri" w:hAnsi="Calibri" w:cs="Calibri"/>
+              <w:sz w:val="18"/>
+              <w:szCs w:val="18"/>
+            </w:rPr>
+            <w:instrText xml:space="preserve"> PAGE </w:instrText>
+          </w:r>
+          <w:r>
+            <w:rPr>
+              <w:rFonts w:ascii="Calibri" w:hAnsi="Calibri" w:cs="Calibri"/>
+              <w:sz w:val="18"/>
+              <w:szCs w:val="18"/>
+            </w:rPr>
+            <w:fldChar w:fldCharType="separate"/>
+          </w:r>
+          <w:r>
+            <w:rPr>
+              <w:rFonts w:ascii="Calibri" w:hAnsi="Calibri" w:cs="Calibri"/>
+              <w:sz w:val="18"/>
+              <w:szCs w:val="18"/>
+            </w:rPr>
+            <w:t>1</w:t>
+          </w:r>
+          <w:r>
+            <w:rPr>
+              <w:rFonts w:ascii="Calibri" w:hAnsi="Calibri" w:cs="Calibri"/>
+              <w:sz w:val="18"/>
+              <w:szCs w:val="18"/>
+            </w:rPr>
+            <w:fldChar w:fldCharType="end"/>
+          </w:r>
+          <w:r>
+            <w:rPr>
+              <w:rFonts w:ascii="Calibri" w:hAnsi="Calibri" w:cs="Calibri"/>
+              <w:sz w:val="18"/>
+              <w:szCs w:val="18"/>
+            </w:rPr>
+            <w:t xml:space="preserve">/ </w:t>
+          </w:r>
+          <w:r>
+            <w:rPr>
+              <w:rFonts w:ascii="Calibri" w:hAnsi="Calibri" w:cs="Calibri"/>
+              <w:sz w:val="18"/>
+              <w:szCs w:val="18"/>
+            </w:rPr>
+            <w:fldChar w:fldCharType="begin"/>
+          </w:r>
+          <w:r>
+            <w:rPr>
+              <w:rFonts w:ascii="Calibri" w:hAnsi="Calibri" w:cs="Calibri"/>
+              <w:sz w:val="18"/>
+              <w:szCs w:val="18"/>
+            </w:rPr>
+            <w:instrText xml:space="preserve"> NUMPAGES </w:instrText>
+          </w:r>
+          <w:r>
+            <w:rPr>
+              <w:rFonts w:ascii="Calibri" w:hAnsi="Calibri" w:cs="Calibri"/>
+              <w:sz w:val="18"/>
+              <w:szCs w:val="18"/>
+            </w:rPr>
+            <w:fldChar w:fldCharType="separate"/>
+          </w:r>
+          <w:r>
+            <w:rPr>
+              <w:rFonts w:ascii="Calibri" w:hAnsi="Calibri" w:cs="Calibri"/>
+              <w:sz w:val="18"/>
+              <w:szCs w:val="18"/>
+            </w:rPr>
+            <w:t>1</w:t>
+          </w:r>
+          <w:r>
+            <w:rPr>
+              <w:rFonts w:ascii="Calibri" w:hAnsi="Calibri" w:cs="Calibri"/>
+              <w:sz w:val="18"/>
+              <w:szCs w:val="18"/>
+            </w:rPr>
+            <w:fldChar w:fldCharType="end"/>
+          </w:r>
+        </w:p>
+      </w:tc>
+    </w:tr>
+  </w:tbl>
+  <w:p>
+    <w:pPr>
+      <w:pStyle w:val="Header"/>
+      <w:spacing w:after="0" w:line="240" w:lineRule="auto"/>
+    </w:pPr>
+  </w:p>
+</w:hdr>
+</file>
+
+<file path=word/header2.xml><?xml version="1.0" encoding="utf-8"?>
+<w:hdr xmlns:w="http://schemas.openxmlformats.org/wordprocessingml/2006/main" xmlns:r="http://schemas.openxmlformats.org/officeDocument/2006/relationships">
+  <w:p>
+    <w:pPr>
+      <w:pStyle w:val="Header"/>
+    </w:pPr>
+  </w:p>
+</w:hdr>
 </file>
 
 <file path=word/numbering.xml><?xml version="1.0" encoding="utf-8"?>

</xml_diff>